<commit_message>
Added Overview Dashboard page from Lovable
</commit_message>
<xml_diff>
--- a/Documentation/AI Prompts/Lovable Prompts/KEN HR Lovable AI Prompts.docx
+++ b/Documentation/AI Prompts/Lovable Prompts/KEN HR Lovable AI Prompts.docx
@@ -401,48 +401,6 @@
       </w:r>
     </w:p>
     <w:p>
-      <w:r>
-        <w:t>Prompt #4:</w:t>
-      </w:r>
-    </w:p>
-    <w:p>
-      <w:r>
-        <w:t>Create a prompt to lovable in order to change the generated source code to use the following:</w:t>
-      </w:r>
-    </w:p>
-    <w:p>
-      <w:r>
-        <w:rPr>
-          <w:b/>
-          <w:bCs/>
-        </w:rPr>
-        <w:t xml:space="preserve">C#, </w:t>
-      </w:r>
-      <w:r>
-        <w:rPr>
-          <w:b/>
-          <w:bCs/>
-        </w:rPr>
-        <w:t xml:space="preserve">Blazor Server, </w:t>
-      </w:r>
-      <w:proofErr w:type="spellStart"/>
-      <w:r>
-        <w:rPr>
-          <w:b/>
-          <w:bCs/>
-        </w:rPr>
-        <w:t>MudBlazor</w:t>
-      </w:r>
-      <w:proofErr w:type="spellEnd"/>
-      <w:r>
-        <w:rPr>
-          <w:b/>
-          <w:bCs/>
-        </w:rPr>
-        <w:t xml:space="preserve"> 8.8.0, EF Core Code-First, SQL Server, and Clean Architecture</w:t>
-      </w:r>
-    </w:p>
-    <w:p>
       <w:pPr>
         <w:rPr>
           <w:b/>
@@ -458,25 +416,7 @@
           <w:color w:val="EE0000"/>
           <w:u w:val="single"/>
         </w:rPr>
-        <w:t>Prompt #</w:t>
-      </w:r>
-      <w:r>
-        <w:rPr>
-          <w:b/>
-          <w:bCs/>
-          <w:color w:val="EE0000"/>
-          <w:u w:val="single"/>
-        </w:rPr>
-        <w:t>5</w:t>
-      </w:r>
-      <w:r>
-        <w:rPr>
-          <w:b/>
-          <w:bCs/>
-          <w:color w:val="EE0000"/>
-          <w:u w:val="single"/>
-        </w:rPr>
-        <w:t>:</w:t>
+        <w:t>Prompt #3:</w:t>
       </w:r>
     </w:p>
     <w:p>

</xml_diff>